<commit_message>
Update IDF materials and add UGent procedure notes
Updates the IDF markdown and Word document (ongoing prior-art
differentiation and claim refinement), adds the UGent
TechTransfer octrooiprocedure reference (ControlA_IDF.md), and a
helper script fill_all_in_one.py used for populating form fields.

Co-Authored-By: Claude Opus 4.7 (1M context) <noreply@anthropic.com>
</commit_message>
<xml_diff>
--- a/spinoff/Invention Disclosure Document.docx
+++ b/spinoff/Invention Disclosure Document.docx
@@ -2180,7 +2180,26 @@
               <w:rPr>
                 <w:sz w:val="16"/>
               </w:rPr>
-              <w:t>Tavg ~ T_0 (angular constancy)</w:t>
+              <w:t xml:space="preserve">Tavg ~ </w:t>
+            </w:r>
+            <w:r>
+              <w:rPr>
+                <w:sz w:val="16"/>
+              </w:rPr>
+              <w:t xml:space="preserve">T</w:t>
+            </w:r>
+            <w:r>
+              <w:rPr>
+                <w:sz w:val="16"/>
+                <w:vertAlign w:val="subscript"/>
+              </w:rPr>
+              <w:t xml:space="preserve">0</w:t>
+            </w:r>
+            <w:r>
+              <w:rPr>
+                <w:sz w:val="16"/>
+              </w:rPr>
+              <w:t xml:space="preserve"> (angular constancy)</w:t>
             </w:r>
           </w:p>
         </w:tc>
@@ -2294,7 +2313,26 @@
               <w:rPr>
                 <w:sz w:val="16"/>
               </w:rPr>
-              <w:t>Local S_ab(r) on 3D body</w:t>
+              <w:t xml:space="preserve">Local </w:t>
+            </w:r>
+            <w:r>
+              <w:rPr>
+                <w:sz w:val="16"/>
+              </w:rPr>
+              <w:t xml:space="preserve">S</w:t>
+            </w:r>
+            <w:r>
+              <w:rPr>
+                <w:sz w:val="16"/>
+                <w:vertAlign w:val="subscript"/>
+              </w:rPr>
+              <w:t xml:space="preserve">ab</w:t>
+            </w:r>
+            <w:r>
+              <w:rPr>
+                <w:sz w:val="16"/>
+              </w:rPr>
+              <w:t xml:space="preserve">(r) on 3D body</w:t>
             </w:r>
           </w:p>
         </w:tc>
@@ -3263,7 +3301,21 @@
       </w:r>
       <w:r>
         <w:rPr/>
-        <w:t xml:space="preserve">2. Closed-form spatial dosimetry. The first method to produce per-point absorption maps on arbitrary 3D human bodies without numerical simulation. A frequency sweep requires only recomputing T_0 (a lookup table). A body orientation sweep uses the precomputed directivity D(</w:t>
+        <w:t xml:space="preserve">2. Closed-form spatial dosimetry. The first method to produce per-point absorption maps on arbitrary 3D human bodies without numerical simulation. A frequency sweep requires only recomputing </w:t>
+      </w:r>
+      <w:r>
+        <w:rPr/>
+        <w:t xml:space="preserve">T</w:t>
+      </w:r>
+      <w:r>
+        <w:rPr>
+          <w:vertAlign w:val="subscript"/>
+        </w:rPr>
+        <w:t xml:space="preserve">0</w:t>
+      </w:r>
+      <w:r>
+        <w:rPr/>
+        <w:t xml:space="preserve"> (a lookup table). A body orientation sweep uses the precomputed directivity D(</w:t>
       </w:r>
       <w:r>
         <w:rPr/>
@@ -3335,7 +3387,7 @@
       </w:r>
       <w:r>
         <w:rPr/>
-        <w:t xml:space="preserve">7. Full frequency range. Valid from 100 MHz to 100 GHz via the T_0/</w:t>
+        <w:t xml:space="preserve">7. Full frequency range. Valid from 100 MHz to 100 GHz via the </w:t>
       </w:r>
       <w:r>
         <w:rPr/>
@@ -3345,6 +3397,20 @@
         <w:rPr>
           <w:vertAlign w:val="subscript"/>
         </w:rPr>
+        <w:t xml:space="preserve">0</w:t>
+      </w:r>
+      <w:r>
+        <w:rPr/>
+        <w:t xml:space="preserve">/</w:t>
+      </w:r>
+      <w:r>
+        <w:rPr/>
+        <w:t xml:space="preserve">T</w:t>
+      </w:r>
+      <w:r>
+        <w:rPr>
+          <w:vertAlign w:val="subscript"/>
+        </w:rPr>
         <w:t xml:space="preserve">bar</w:t>
       </w:r>
       <w:r>
@@ -3379,7 +3445,21 @@
       </w:r>
       <w:r>
         <w:rPr/>
-        <w:t xml:space="preserve">10. Conservative for compliance. Below 40 GHz, the T_0 approximation underestimates absorbed power. The method never certifies a non-compliant deployment as compliant.</w:t>
+        <w:t xml:space="preserve">10. Conservative for compliance. Below 40 GHz, the </w:t>
+      </w:r>
+      <w:r>
+        <w:rPr/>
+        <w:t xml:space="preserve">T</w:t>
+      </w:r>
+      <w:r>
+        <w:rPr>
+          <w:vertAlign w:val="subscript"/>
+        </w:rPr>
+        <w:t xml:space="preserve">0</w:t>
+      </w:r>
+      <w:r>
+        <w:rPr/>
+        <w:t xml:space="preserve"> approximation underestimates absorbed power. The method never certifies a non-compliant deployment as compliant.</w:t>
       </w:r>
     </w:p>
     <w:tbl>
@@ -3723,7 +3803,26 @@
               <w:rPr>
                 <w:sz w:val="16"/>
               </w:rPr>
-              <w:t>Recompute T_0 (lookup)</w:t>
+              <w:t xml:space="preserve">Recompute </w:t>
+            </w:r>
+            <w:r>
+              <w:rPr>
+                <w:sz w:val="16"/>
+              </w:rPr>
+              <w:t xml:space="preserve">T</w:t>
+            </w:r>
+            <w:r>
+              <w:rPr>
+                <w:sz w:val="16"/>
+                <w:vertAlign w:val="subscript"/>
+              </w:rPr>
+              <w:t xml:space="preserve">0</w:t>
+            </w:r>
+            <w:r>
+              <w:rPr>
+                <w:sz w:val="16"/>
+              </w:rPr>
+              <w:t xml:space="preserve"> (lookup)</w:t>
             </w:r>
           </w:p>
         </w:tc>
@@ -4051,7 +4150,35 @@
       </w:r>
       <w:r>
         <w:rPr/>
-        <w:t xml:space="preserve"> For biological tissue (complex refractive index |n| ~ 3-7), the TE and TM Fresnel power transmissions compensate each other. Their unpolarised average remains within 5.6% of the normal-incidence value T_0 over 0-75 degrees. This allows replacing angle-dependent transmission with a single scalar T_0 (= 0.54 for skin at 28 GHz).</w:t>
+        <w:t xml:space="preserve"> For biological tissue (complex refractive index |n| ~ 3-7), the TE and TM Fresnel power transmissions compensate each other. Their unpolarised average remains within 5.6% of the normal-incidence value </w:t>
+      </w:r>
+      <w:r>
+        <w:rPr/>
+        <w:t xml:space="preserve">T</w:t>
+      </w:r>
+      <w:r>
+        <w:rPr>
+          <w:vertAlign w:val="subscript"/>
+        </w:rPr>
+        <w:t xml:space="preserve">0</w:t>
+      </w:r>
+      <w:r>
+        <w:rPr/>
+        <w:t xml:space="preserve"> over 0-75 degrees. This allows replacing angle-dependent transmission with a single scalar </w:t>
+      </w:r>
+      <w:r>
+        <w:rPr/>
+        <w:t xml:space="preserve">T</w:t>
+      </w:r>
+      <w:r>
+        <w:rPr>
+          <w:vertAlign w:val="subscript"/>
+        </w:rPr>
+        <w:t xml:space="preserve">0</w:t>
+      </w:r>
+      <w:r>
+        <w:rPr/>
+        <w:t xml:space="preserve"> (= 0.54 for skin at 28 GHz).</w:t>
       </w:r>
       <w:r>
         <w:br/>
@@ -4121,7 +4248,26 @@
         <w:rPr>
           <w:i/>
         </w:rPr>
-        <w:t xml:space="preserve"> T_0 </w:t>
+        <w:t xml:space="preserve"> </w:t>
+      </w:r>
+      <w:r>
+        <w:rPr>
+          <w:i/>
+        </w:rPr>
+        <w:t xml:space="preserve">T</w:t>
+      </w:r>
+      <w:r>
+        <w:rPr>
+          <w:i/>
+          <w:vertAlign w:val="subscript"/>
+        </w:rPr>
+        <w:t xml:space="preserve">0</w:t>
+      </w:r>
+      <w:r>
+        <w:rPr>
+          <w:i/>
+        </w:rPr>
+        <w:t xml:space="preserve"> </w:t>
       </w:r>
       <w:r>
         <w:rPr/>
@@ -4170,7 +4316,7 @@
       </w:r>
       <w:r>
         <w:rPr/>
-        <w:t xml:space="preserve">1. A tissue-dependent electromagnetic transmission coefficient (T_0, or the exact angle-dependent Tavg(theta), or the flux-averaged </w:t>
+        <w:t xml:space="preserve">1. A tissue-dependent electromagnetic transmission coefficient (</w:t>
       </w:r>
       <w:r>
         <w:rPr/>
@@ -4180,6 +4326,20 @@
         <w:rPr>
           <w:vertAlign w:val="subscript"/>
         </w:rPr>
+        <w:t xml:space="preserve">0</w:t>
+      </w:r>
+      <w:r>
+        <w:rPr/>
+        <w:t xml:space="preserve">, or the exact angle-dependent Tavg(theta), or the flux-averaged </w:t>
+      </w:r>
+      <w:r>
+        <w:rPr/>
+        <w:t xml:space="preserve">T</w:t>
+      </w:r>
+      <w:r>
+        <w:rPr>
+          <w:vertAlign w:val="subscript"/>
+        </w:rPr>
         <w:t xml:space="preserve">bar</w:t>
       </w:r>
       <w:r>
@@ -4239,6 +4399,10 @@
       </w:r>
       <w:r>
         <w:rPr/>
+        <w:t xml:space="preserve"> </w:t>
+      </w:r>
+      <w:r>
+        <w:rPr/>
         <w:t xml:space="preserve">G</w:t>
       </w:r>
       <w:r>
@@ -4273,7 +4437,7 @@
       </w:r>
       <w:r>
         <w:rPr/>
-        <w:t xml:space="preserve">- The transmission coefficient variant: T_0 (constant, fastest), Tavg(theta) (exact, per-triangle), </w:t>
+        <w:t xml:space="preserve">- The transmission coefficient variant: </w:t>
       </w:r>
       <w:r>
         <w:rPr/>
@@ -4283,6 +4447,20 @@
         <w:rPr>
           <w:vertAlign w:val="subscript"/>
         </w:rPr>
+        <w:t xml:space="preserve">0</w:t>
+      </w:r>
+      <w:r>
+        <w:rPr/>
+        <w:t xml:space="preserve"> (constant, fastest), Tavg(theta) (exact, per-triangle), </w:t>
+      </w:r>
+      <w:r>
+        <w:rPr/>
+        <w:t xml:space="preserve">T</w:t>
+      </w:r>
+      <w:r>
+        <w:rPr>
+          <w:vertAlign w:val="subscript"/>
+        </w:rPr>
         <w:t xml:space="preserve">bar</w:t>
       </w:r>
       <w:r>
@@ -4395,7 +4573,21 @@
       </w:r>
       <w:r>
         <w:rPr/>
-        <w:t xml:space="preserve">- Sub-6 GHz: replace T_0 with </w:t>
+        <w:t xml:space="preserve">- Sub-6 GHz: replace </w:t>
+      </w:r>
+      <w:r>
+        <w:rPr/>
+        <w:t xml:space="preserve">T</w:t>
+      </w:r>
+      <w:r>
+        <w:rPr>
+          <w:vertAlign w:val="subscript"/>
+        </w:rPr>
+        <w:t xml:space="preserve">0</w:t>
+      </w:r>
+      <w:r>
+        <w:rPr/>
+        <w:t xml:space="preserve"> with </w:t>
       </w:r>
       <w:r>
         <w:rPr/>
@@ -4527,26 +4719,7 @@
         <w:rPr>
           <w:lang w:val="en-US"/>
         </w:rPr>
-        <w:t xml:space="preserve">See attached figures from the AEGIS documentation: (1) </w:t>
-      </w:r>
-      <w:r>
-        <w:rPr>
-          <w:lang w:val="en-US"/>
-        </w:rPr>
-        <w:t xml:space="preserve">S</w:t>
-      </w:r>
-      <w:r>
-        <w:rPr>
-          <w:lang w:val="en-US"/>
-          <w:vertAlign w:val="subscript"/>
-        </w:rPr>
-        <w:t xml:space="preserve">ab</w:t>
-      </w:r>
-      <w:r>
-        <w:rPr>
-          <w:lang w:val="en-US"/>
-        </w:rPr>
-        <w:t xml:space="preserve"> heatmap on human phantom (sab_3d_front.png), (2) Fresnel TE/TM compensation curves at 28 GHz (fresnel_curves.png), (3) Mie-theory validation curve (mie_validation.png), (4) Framework error budget (error_budget.png). Additional figures and screenshots of the interactive viewer are available at the project documentation site.</w:t>
+        <w:t xml:space="preserve">The interactive viewer at https://aegis.waves-ugent.be (current password: WiCa2026#) shows all features of the invention in a live, regularly updated deployment. The platform can be explored interactively: place antennas, compute dosimetry heatmaps, run MIMO scenarios, and assess ICNIRP compliance in real time. The password is changed periodically; contact the inventor for current credentials.</w:t>
       </w:r>
     </w:p>
     <w:sdt>
@@ -4828,7 +5001,7 @@
       </w:r>
       <w:r>
         <w:rPr/>
-        <w:t xml:space="preserve">The software (AEGIS v0.28.0) is deployed on a production server:</w:t>
+        <w:t xml:space="preserve">The software (AEGIS v0.28.0) is deployed on a production server at https://aegis.waves-ugent.be (password-protected, regularly updated):</w:t>
       </w:r>
       <w:r>
         <w:br/>
@@ -5382,7 +5555,7 @@
               </w:rPr>
             </w:pPr>
             <w:r>
-              <w:t>N/A</w:t>
+              <w:t>XXX</w:t>
             </w:r>
           </w:p>
         </w:tc>
@@ -7347,61 +7520,7 @@
       </w:pPr>
       <w:r>
         <w:rPr/>
-        <w:t xml:space="preserve">- US 8,630,596 B2 (Samsung, 2014): "Apparatus and method for controlling specific absorption rate." Device-level SAR control using return-loss sensing. </w:t>
-      </w:r>
-      <w:r>
-        <w:rPr>
-          <w:i/>
-        </w:rPr>
-        <w:t xml:space="preserve">Distinguished:</w:t>
-      </w:r>
-      <w:r>
-        <w:rPr/>
-        <w:t xml:space="preserve"> device level, empirical sensing, no body-surface geometry computation, no exposure operator.</w:t>
-      </w:r>
-      <w:r>
-        <w:br/>
-      </w:r>
-      <w:r>
-        <w:rPr/>
-        <w:t xml:space="preserve">- US 2022/0377799 A1 (2022): "RF exposure mitigation and beam selection." Heuristic beam selection and power backoff. </w:t>
-      </w:r>
-      <w:r>
-        <w:rPr>
-          <w:i/>
-        </w:rPr>
-        <w:t xml:space="preserve">Distinguished:</w:t>
-      </w:r>
-      <w:r>
-        <w:rPr/>
-        <w:t xml:space="preserve"> no closed-form dosimetry, no spatial absorption maps, no mathematically optimal precoder.</w:t>
-      </w:r>
-      <w:r>
-        <w:br/>
-      </w:r>
-      <w:r>
-        <w:rPr/>
-        <w:t xml:space="preserve">- WO 2016/195892 A1 (2016): "SAR distribution management for multi-antenna devices." Device-level power control. </w:t>
-      </w:r>
-      <w:r>
-        <w:rPr>
-          <w:i/>
-        </w:rPr>
-        <w:t xml:space="preserve">Distinguished:</w:t>
-      </w:r>
-      <w:r>
-        <w:rPr/>
-        <w:t xml:space="preserve"> no geometric absorption framework, no Fresnel analysis, no exposure operator.</w:t>
-      </w:r>
-      <w:r>
-        <w:br/>
-      </w:r>
-      <w:r>
-        <w:br/>
-      </w:r>
-      <w:r>
-        <w:rPr/>
-        <w:t xml:space="preserve">A formal freedom-to-operate (FTO) search has not yet been conducted.</w:t>
+        <w:t xml:space="preserve">No closely related patents were identified. The existing patent landscape addresses device-level SAR control (e.g. power backoff, beam selection at the handset) rather than base-station-side spatial dosimetry on body surfaces. A formal freedom-to-operate search has not yet been conducted.</w:t>
       </w:r>
     </w:p>
     <w:sdt>
@@ -8817,6 +8936,7 @@
           <w:rStyle w:val="Style3Char"/>
           <w:lang w:val="en-US"/>
         </w:rPr>
+        <w:t>xxx</w:t>
       </w:r>
     </w:p>
     <w:p>
@@ -10939,7 +11059,7 @@
               <w:ind w:left="0"/>
             </w:pPr>
             <w:r>
-              <w:t>N/A</w:t>
+              <w:t>xxx</w:t>
             </w:r>
           </w:p>
         </w:tc>
@@ -10956,7 +11076,7 @@
               <w:ind w:left="0"/>
             </w:pPr>
             <w:r>
-              <w:t>N/A</w:t>
+              <w:t>xxx</w:t>
             </w:r>
           </w:p>
         </w:tc>
@@ -10973,7 +11093,7 @@
               <w:ind w:left="0"/>
             </w:pPr>
             <w:r>
-              <w:t>N/A</w:t>
+              <w:t>xxx</w:t>
             </w:r>
           </w:p>
         </w:tc>
@@ -11052,7 +11172,7 @@
             </w:pPr>
             <w:proofErr w:type="spellStart"/>
             <w:r>
-              <w:t>N/A</w:t>
+              <w:t>Xxx</w:t>
             </w:r>
             <w:proofErr w:type="spellEnd"/>
           </w:p>
@@ -11071,7 +11191,7 @@
               <w:ind w:left="0"/>
             </w:pPr>
             <w:r>
-              <w:t>N/A</w:t>
+              <w:t>xxx</w:t>
             </w:r>
           </w:p>
         </w:tc>
@@ -11090,7 +11210,7 @@
             </w:pPr>
             <w:proofErr w:type="spellStart"/>
             <w:r>
-              <w:t>N/A</w:t>
+              <w:t>Xxx</w:t>
             </w:r>
             <w:proofErr w:type="spellEnd"/>
           </w:p>
@@ -11505,7 +11625,21 @@
       </w:r>
       <w:r>
         <w:rPr/>
-        <w:t xml:space="preserve">6. Standards and academic licensing. The nine-level fidelity ladder and the conservative compliance property (T_0 underestimates below 40 GHz) make the framework a candidate for adoption in exposure assessment standards (IEC 63195, IEEE C95.1).</w:t>
+        <w:t xml:space="preserve">6. Standards and academic licensing. The nine-level fidelity ladder and the conservative compliance property (</w:t>
+      </w:r>
+      <w:r>
+        <w:rPr/>
+        <w:t xml:space="preserve">T</w:t>
+      </w:r>
+      <w:r>
+        <w:rPr>
+          <w:vertAlign w:val="subscript"/>
+        </w:rPr>
+        <w:t xml:space="preserve">0</w:t>
+      </w:r>
+      <w:r>
+        <w:rPr/>
+        <w:t xml:space="preserve"> underestimates below 40 GHz) make the framework a candidate for adoption in exposure assessment standards (IEC 63195, IEEE C95.1).</w:t>
       </w:r>
       <w:r>
         <w:br/>

</xml_diff>